<commit_message>
Linux_Build: plug-in libraries on Linux and a test checklist for the features since 0.1.0.58
Co-Authored-By: Claude Opus 5.5 <noreply@anthropic.com>
</commit_message>
<xml_diff>
--- a/docs/Linux_Build.docx
+++ b/docs/Linux_Build.docx
@@ -809,6 +809,921 @@
         <w:t xml:space="preserve">undoes everything. The program also loads its window icon from its own resource at start-up.</w:t>
       </w:r>
     </w:p>
+    <w:p>
+      <w:pPr>
+        <w:pStyle w:val="Heading2"/>
+      </w:pPr>
+      <w:bookmarkStart w:id="14" w:name="_7a25d0910e787984b47dd64b24e9f7b80717fe3"/>
+      <w:r>
+        <w:t xml:space="preserve">Plug-in libraries on Linux</w:t>
+      </w:r>
+      <w:bookmarkEnd w:id="14"/>
+    </w:p>
+    <w:p>
+      <w:pPr>
+        <w:pStyle w:val="FirstParagraph"/>
+      </w:pPr>
+      <w:r>
+        <w:t xml:space="preserve">A plug-in is a</w:t>
+      </w:r>
+      <w:r>
+        <w:t xml:space="preserve"> </w:t>
+      </w:r>
+      <w:r>
+        <w:rPr>
+          <w:rStyle w:val="VerbatimChar"/>
+        </w:rPr>
+        <w:t xml:space="preserve">.so</w:t>
+      </w:r>
+      <w:r>
+        <w:t xml:space="preserve"> </w:t>
+      </w:r>
+      <w:r>
+        <w:t xml:space="preserve">file built on Linux (a Windows</w:t>
+      </w:r>
+      <w:r>
+        <w:t xml:space="preserve"> </w:t>
+      </w:r>
+      <w:r>
+        <w:rPr>
+          <w:rStyle w:val="VerbatimChar"/>
+        </w:rPr>
+        <w:t xml:space="preserve">.dll</w:t>
+      </w:r>
+      <w:r>
+        <w:t xml:space="preserve"> </w:t>
+      </w:r>
+      <w:r>
+        <w:t xml:space="preserve">does not load on Linux). The example in the repository:</w:t>
+      </w:r>
+    </w:p>
+    <w:p>
+      <w:pPr>
+        <w:pStyle w:val="SourceCode"/>
+      </w:pPr>
+      <w:r>
+        <w:rPr>
+          <w:rStyle w:val="VerbatimChar"/>
+        </w:rPr>
+        <w:t xml:space="preserve">cd plugins/example</w:t>
+      </w:r>
+      <w:r>
+        <w:br/>
+      </w:r>
+      <w:r>
+        <w:rPr>
+          <w:rStyle w:val="VerbatimChar"/>
+        </w:rPr>
+        <w:t xml:space="preserve">fpc -B -Cg example_plugin.lpr          # makes libexample_plugin.so</w:t>
+      </w:r>
+      <w:r>
+        <w:br/>
+      </w:r>
+      <w:r>
+        <w:rPr>
+          <w:rStyle w:val="VerbatimChar"/>
+        </w:rPr>
+        <w:t xml:space="preserve">mkdir -p "$HOME/.config/Photo Downloader/plugins"</w:t>
+      </w:r>
+      <w:r>
+        <w:br/>
+      </w:r>
+      <w:r>
+        <w:rPr>
+          <w:rStyle w:val="VerbatimChar"/>
+        </w:rPr>
+        <w:t xml:space="preserve">cp libexample_plugin.so "$HOME/.config/Photo Downloader/plugins/"</w:t>
+      </w:r>
+    </w:p>
+    <w:p>
+      <w:pPr>
+        <w:pStyle w:val="FirstParagraph"/>
+      </w:pPr>
+      <w:r>
+        <w:rPr>
+          <w:rStyle w:val="VerbatimChar"/>
+        </w:rPr>
+        <w:t xml:space="preserve">-Cg</w:t>
+      </w:r>
+      <w:r>
+        <w:t xml:space="preserve"> </w:t>
+      </w:r>
+      <w:r>
+        <w:t xml:space="preserve">makes position-independent code, which a shared library needs. The plug-in folder is the</w:t>
+      </w:r>
+      <w:r>
+        <w:t xml:space="preserve"> </w:t>
+      </w:r>
+      <w:r>
+        <w:rPr>
+          <w:rStyle w:val="VerbatimChar"/>
+        </w:rPr>
+        <w:t xml:space="preserve">plugins</w:t>
+      </w:r>
+      <w:r>
+        <w:t xml:space="preserve"> </w:t>
+      </w:r>
+      <w:r>
+        <w:t xml:space="preserve">folder next to the settings file (File &gt; Status shows where the settings file is; on Linux it is normally</w:t>
+      </w:r>
+      <w:r>
+        <w:t xml:space="preserve"> </w:t>
+      </w:r>
+      <w:r>
+        <w:rPr>
+          <w:rStyle w:val="VerbatimChar"/>
+        </w:rPr>
+        <w:t xml:space="preserve">~/.config/Photo Downloader/</w:t>
+      </w:r>
+      <w:r>
+        <w:t xml:space="preserve">), or a</w:t>
+      </w:r>
+      <w:r>
+        <w:t xml:space="preserve"> </w:t>
+      </w:r>
+      <w:r>
+        <w:rPr>
+          <w:rStyle w:val="VerbatimChar"/>
+        </w:rPr>
+        <w:t xml:space="preserve">plugins</w:t>
+      </w:r>
+      <w:r>
+        <w:t xml:space="preserve"> </w:t>
+      </w:r>
+      <w:r>
+        <w:t xml:space="preserve">folder next to the program. See</w:t>
+      </w:r>
+      <w:r>
+        <w:t xml:space="preserve"> </w:t>
+      </w:r>
+      <w:r>
+        <w:rPr>
+          <w:rStyle w:val="VerbatimChar"/>
+        </w:rPr>
+        <w:t xml:space="preserve">docs/Plugin_Developer_Manual.md</w:t>
+      </w:r>
+      <w:r>
+        <w:t xml:space="preserve">.</w:t>
+      </w:r>
+    </w:p>
+    <w:p>
+      <w:pPr>
+        <w:pStyle w:val="Heading2"/>
+      </w:pPr>
+      <w:bookmarkStart w:id="15" w:name="_59d4d1f77195eacf2b7010fa15c19f289d9d67f"/>
+      <w:r>
+        <w:t xml:space="preserve">Linux test checklist (features added since the last Linux test, 0.1.0.58)</w:t>
+      </w:r>
+      <w:bookmarkEnd w:id="15"/>
+    </w:p>
+    <w:p>
+      <w:pPr>
+        <w:pStyle w:val="FirstParagraph"/>
+      </w:pPr>
+      <w:r>
+        <w:t xml:space="preserve">Build with</w:t>
+      </w:r>
+      <w:r>
+        <w:t xml:space="preserve"> </w:t>
+      </w:r>
+      <w:r>
+        <w:rPr>
+          <w:rStyle w:val="VerbatimChar"/>
+        </w:rPr>
+        <w:t xml:space="preserve">lazbuild -B --ws=gtk2 PhotoDownloader.lpi</w:t>
+      </w:r>
+      <w:r>
+        <w:t xml:space="preserve">, start</w:t>
+      </w:r>
+      <w:r>
+        <w:t xml:space="preserve"> </w:t>
+      </w:r>
+      <w:r>
+        <w:rPr>
+          <w:rStyle w:val="VerbatimChar"/>
+        </w:rPr>
+        <w:t xml:space="preserve">bin/linux/PhotoDownloader</w:t>
+      </w:r>
+      <w:r>
+        <w:t xml:space="preserve"> </w:t>
+      </w:r>
+      <w:r>
+        <w:t xml:space="preserve">from a terminal (messages appear there), and turn on Help &gt; Logging.</w:t>
+      </w:r>
+    </w:p>
+    <w:tbl>
+      <w:tblPr>
+        <w:tblStyle w:val="Table"/>
+        <w:tblW w:type="pct" w:w="5000"/>
+        <w:tblLayout w:type="fixed"/>
+        <w:tblLook w:firstRow="1" w:lastRow="0" w:firstColumn="0" w:lastColumn="0" w:noHBand="0" w:noVBand="0" w:val="0020"/>
+      </w:tblPr>
+      <w:tblGrid>
+        <w:gridCol w:w="2640"/>
+        <w:gridCol w:w="2640"/>
+        <w:gridCol w:w="2640"/>
+      </w:tblGrid>
+      <w:tr>
+        <w:trPr>
+          <w:tblHeader w:val="on"/>
+        </w:trPr>
+        <w:tc>
+          <w:tcPr/>
+          <w:p>
+            <w:pPr>
+              <w:pStyle w:val="Compact"/>
+            </w:pPr>
+            <w:r>
+              <w:t xml:space="preserve">#</w:t>
+            </w:r>
+          </w:p>
+        </w:tc>
+        <w:tc>
+          <w:tcPr/>
+          <w:p>
+            <w:pPr>
+              <w:pStyle w:val="Compact"/>
+            </w:pPr>
+            <w:r>
+              <w:t xml:space="preserve">Test</w:t>
+            </w:r>
+          </w:p>
+        </w:tc>
+        <w:tc>
+          <w:tcPr/>
+          <w:p>
+            <w:pPr>
+              <w:pStyle w:val="Compact"/>
+            </w:pPr>
+            <w:r>
+              <w:t xml:space="preserve">Expected</w:t>
+            </w:r>
+          </w:p>
+        </w:tc>
+      </w:tr>
+      <w:tr>
+        <w:tc>
+          <w:tcPr/>
+          <w:p>
+            <w:pPr>
+              <w:pStyle w:val="Compact"/>
+            </w:pPr>
+            <w:r>
+              <w:t xml:space="preserve">1</w:t>
+            </w:r>
+          </w:p>
+        </w:tc>
+        <w:tc>
+          <w:tcPr/>
+          <w:p>
+            <w:pPr>
+              <w:pStyle w:val="Compact"/>
+            </w:pPr>
+            <w:r>
+              <w:t xml:space="preserve">Start the program</w:t>
+            </w:r>
+          </w:p>
+        </w:tc>
+        <w:tc>
+          <w:tcPr/>
+          <w:p>
+            <w:pPr>
+              <w:pStyle w:val="Compact"/>
+            </w:pPr>
+            <w:r>
+              <w:t xml:space="preserve">Splash, then the job code window; no error messages in the terminal</w:t>
+            </w:r>
+          </w:p>
+        </w:tc>
+      </w:tr>
+      <w:tr>
+        <w:tc>
+          <w:tcPr/>
+          <w:p>
+            <w:pPr>
+              <w:pStyle w:val="Compact"/>
+            </w:pPr>
+            <w:r>
+              <w:t xml:space="preserve">2</w:t>
+            </w:r>
+          </w:p>
+        </w:tc>
+        <w:tc>
+          <w:tcPr/>
+          <w:p>
+            <w:pPr>
+              <w:pStyle w:val="Compact"/>
+            </w:pPr>
+            <w:r>
+              <w:t xml:space="preserve">File &gt; Status</w:t>
+            </w:r>
+          </w:p>
+        </w:tc>
+        <w:tc>
+          <w:tcPr/>
+          <w:p>
+            <w:pPr>
+              <w:pStyle w:val="Compact"/>
+            </w:pPr>
+            <w:r>
+              <w:t xml:space="preserve">Settings file under</w:t>
+            </w:r>
+            <w:r>
+              <w:t xml:space="preserve"> </w:t>
+            </w:r>
+            <w:r>
+              <w:rPr>
+                <w:rStyle w:val="VerbatimChar"/>
+              </w:rPr>
+              <w:t xml:space="preserve">~/.config/...</w:t>
+            </w:r>
+            <w:r>
+              <w:t xml:space="preserve">;</w:t>
+            </w:r>
+            <w:r>
+              <w:t xml:space="preserve"> </w:t>
+            </w:r>
+            <w:r>
+              <w:t xml:space="preserve">“SQLite library”</w:t>
+            </w:r>
+            <w:r>
+              <w:t xml:space="preserve"> </w:t>
+            </w:r>
+            <w:r>
+              <w:t xml:space="preserve">line names</w:t>
+            </w:r>
+            <w:r>
+              <w:t xml:space="preserve"> </w:t>
+            </w:r>
+            <w:r>
+              <w:rPr>
+                <w:rStyle w:val="VerbatimChar"/>
+              </w:rPr>
+              <w:t xml:space="preserve">libsqlite3.so.0</w:t>
+            </w:r>
+            <w:r>
+              <w:t xml:space="preserve"> </w:t>
+            </w:r>
+            <w:r>
+              <w:t xml:space="preserve">(or says it is missing)</w:t>
+            </w:r>
+          </w:p>
+        </w:tc>
+      </w:tr>
+      <w:tr>
+        <w:tc>
+          <w:tcPr/>
+          <w:p>
+            <w:pPr>
+              <w:pStyle w:val="Compact"/>
+            </w:pPr>
+            <w:r>
+              <w:t xml:space="preserve">3</w:t>
+            </w:r>
+          </w:p>
+        </w:tc>
+        <w:tc>
+          <w:tcPr/>
+          <w:p>
+            <w:pPr>
+              <w:pStyle w:val="Compact"/>
+            </w:pPr>
+            <w:r>
+              <w:t xml:space="preserve">Open a card or folder with JPG, RAW/DNG, MP4 and LRV files</w:t>
+            </w:r>
+          </w:p>
+        </w:tc>
+        <w:tc>
+          <w:tcPr/>
+          <w:p>
+            <w:pPr>
+              <w:pStyle w:val="Compact"/>
+            </w:pPr>
+            <w:r>
+              <w:t xml:space="preserve">Thumbnails, dates and camera names; a second scan of the same folder is much faster (EXIF cache)</w:t>
+            </w:r>
+          </w:p>
+        </w:tc>
+      </w:tr>
+      <w:tr>
+        <w:tc>
+          <w:tcPr/>
+          <w:p>
+            <w:pPr>
+              <w:pStyle w:val="Compact"/>
+            </w:pPr>
+            <w:r>
+              <w:t xml:space="preserve">4</w:t>
+            </w:r>
+          </w:p>
+        </w:tc>
+        <w:tc>
+          <w:tcPr/>
+          <w:p>
+            <w:pPr>
+              <w:pStyle w:val="Compact"/>
+            </w:pPr>
+            <w:r>
+              <w:t xml:space="preserve">Lightroom previews (.lrprev) with Preferences &gt; General</w:t>
+            </w:r>
+            <w:r>
+              <w:t xml:space="preserve"> </w:t>
+            </w:r>
+            <w:r>
+              <w:t xml:space="preserve">“Scan Lightroom preview folders”</w:t>
+            </w:r>
+            <w:r>
+              <w:t xml:space="preserve"> </w:t>
+            </w:r>
+            <w:r>
+              <w:t xml:space="preserve">on</w:t>
+            </w:r>
+          </w:p>
+        </w:tc>
+        <w:tc>
+          <w:tcPr/>
+          <w:p>
+            <w:pPr>
+              <w:pStyle w:val="Compact"/>
+            </w:pPr>
+            <w:r>
+              <w:t xml:space="preserve">Previews listed with the photo’s name and date when the catalog is next to the</w:t>
+            </w:r>
+            <w:r>
+              <w:t xml:space="preserve"> </w:t>
+            </w:r>
+            <w:r>
+              <w:rPr>
+                <w:rStyle w:val="VerbatimChar"/>
+              </w:rPr>
+              <w:t xml:space="preserve">.lrdata</w:t>
+            </w:r>
+            <w:r>
+              <w:t xml:space="preserve"> </w:t>
+            </w:r>
+            <w:r>
+              <w:t xml:space="preserve">folder</w:t>
+            </w:r>
+          </w:p>
+        </w:tc>
+      </w:tr>
+      <w:tr>
+        <w:tc>
+          <w:tcPr/>
+          <w:p>
+            <w:pPr>
+              <w:pStyle w:val="Compact"/>
+            </w:pPr>
+            <w:r>
+              <w:t xml:space="preserve">5</w:t>
+            </w:r>
+          </w:p>
+        </w:tc>
+        <w:tc>
+          <w:tcPr/>
+          <w:p>
+            <w:pPr>
+              <w:pStyle w:val="Compact"/>
+            </w:pPr>
+            <w:r>
+              <w:t xml:space="preserve">Download Path tab: folder</w:t>
+            </w:r>
+            <w:r>
+              <w:t xml:space="preserve"> </w:t>
+            </w:r>
+            <w:r>
+              <w:rPr>
+                <w:rStyle w:val="VerbatimChar"/>
+              </w:rPr>
+              <w:t xml:space="preserve">.../{Y}/{E}/</w:t>
+            </w:r>
+            <w:r>
+              <w:t xml:space="preserve">, file</w:t>
+            </w:r>
+            <w:r>
+              <w:t xml:space="preserve"> </w:t>
+            </w:r>
+            <w:r>
+              <w:rPr>
+                <w:rStyle w:val="VerbatimChar"/>
+              </w:rPr>
+              <w:t xml:space="preserve">{o}-{e}</w:t>
+            </w:r>
+          </w:p>
+        </w:tc>
+        <w:tc>
+          <w:tcPr/>
+          <w:p>
+            <w:pPr>
+              <w:pStyle w:val="Compact"/>
+            </w:pPr>
+            <w:r>
+              <w:t xml:space="preserve">Example line shows</w:t>
+            </w:r>
+            <w:r>
+              <w:t xml:space="preserve"> </w:t>
+            </w:r>
+            <w:r>
+              <w:rPr>
+                <w:rStyle w:val="VerbatimChar"/>
+              </w:rPr>
+              <w:t xml:space="preserve">JPG</w:t>
+            </w:r>
+            <w:r>
+              <w:t xml:space="preserve"> </w:t>
+            </w:r>
+            <w:r>
+              <w:t xml:space="preserve">/</w:t>
+            </w:r>
+            <w:r>
+              <w:t xml:space="preserve"> </w:t>
+            </w:r>
+            <w:r>
+              <w:rPr>
+                <w:rStyle w:val="VerbatimChar"/>
+              </w:rPr>
+              <w:t xml:space="preserve">jpg</w:t>
+            </w:r>
+            <w:r>
+              <w:t xml:space="preserve">; files land in one folder per type</w:t>
+            </w:r>
+          </w:p>
+        </w:tc>
+      </w:tr>
+      <w:tr>
+        <w:tc>
+          <w:tcPr/>
+          <w:p>
+            <w:pPr>
+              <w:pStyle w:val="Compact"/>
+            </w:pPr>
+            <w:r>
+              <w:t xml:space="preserve">6</w:t>
+            </w:r>
+          </w:p>
+        </w:tc>
+        <w:tc>
+          <w:tcPr/>
+          <w:p>
+            <w:pPr>
+              <w:pStyle w:val="Compact"/>
+            </w:pPr>
+            <w:r>
+              <w:t xml:space="preserve">Select a few files,</w:t>
+            </w:r>
+            <w:r>
+              <w:t xml:space="preserve"> </w:t>
+            </w:r>
+            <w:r>
+              <w:rPr>
+                <w:b/>
+                <w:bCs/>
+              </w:rPr>
+              <w:t xml:space="preserve">Download Selected</w:t>
+            </w:r>
+            <w:r>
+              <w:t xml:space="preserve">; then</w:t>
+            </w:r>
+            <w:r>
+              <w:t xml:space="preserve"> </w:t>
+            </w:r>
+            <w:r>
+              <w:rPr>
+                <w:b/>
+                <w:bCs/>
+              </w:rPr>
+              <w:t xml:space="preserve">Download All</w:t>
+            </w:r>
+          </w:p>
+        </w:tc>
+        <w:tc>
+          <w:tcPr/>
+          <w:p>
+            <w:pPr>
+              <w:pStyle w:val="Compact"/>
+            </w:pPr>
+            <w:r>
+              <w:t xml:space="preserve">Only the selected files first, then the rest; the buttons are greyed out when there is nothing to download</w:t>
+            </w:r>
+          </w:p>
+        </w:tc>
+      </w:tr>
+      <w:tr>
+        <w:tc>
+          <w:tcPr/>
+          <w:p>
+            <w:pPr>
+              <w:pStyle w:val="Compact"/>
+            </w:pPr>
+            <w:r>
+              <w:t xml:space="preserve">7</w:t>
+            </w:r>
+          </w:p>
+        </w:tc>
+        <w:tc>
+          <w:tcPr/>
+          <w:p>
+            <w:pPr>
+              <w:pStyle w:val="Compact"/>
+            </w:pPr>
+            <w:r>
+              <w:t xml:space="preserve">File &gt; Plug-ins…</w:t>
+            </w:r>
+          </w:p>
+        </w:tc>
+        <w:tc>
+          <w:tcPr/>
+          <w:p>
+            <w:pPr>
+              <w:pStyle w:val="Compact"/>
+            </w:pPr>
+            <w:r>
+              <w:t xml:space="preserve">Preferences opens on the Plug-ins tab</w:t>
+            </w:r>
+          </w:p>
+        </w:tc>
+      </w:tr>
+      <w:tr>
+        <w:tc>
+          <w:tcPr/>
+          <w:p>
+            <w:pPr>
+              <w:pStyle w:val="Compact"/>
+            </w:pPr>
+            <w:r>
+              <w:t xml:space="preserve">8</w:t>
+            </w:r>
+          </w:p>
+        </w:tc>
+        <w:tc>
+          <w:tcPr/>
+          <w:p>
+            <w:pPr>
+              <w:pStyle w:val="Compact"/>
+            </w:pPr>
+            <w:r>
+              <w:t xml:space="preserve">Install the example plug-in (above), restart, switch it on</w:t>
+            </w:r>
+          </w:p>
+        </w:tc>
+        <w:tc>
+          <w:tcPr/>
+          <w:p>
+            <w:pPr>
+              <w:pStyle w:val="Compact"/>
+            </w:pPr>
+            <w:r>
+              <w:t xml:space="preserve">Confirmation with the</w:t>
+            </w:r>
+            <w:r>
+              <w:t xml:space="preserve"> </w:t>
+            </w:r>
+            <w:r>
+              <w:rPr>
+                <w:rStyle w:val="VerbatimChar"/>
+              </w:rPr>
+              <w:t xml:space="preserve">.so</w:t>
+            </w:r>
+            <w:r>
+              <w:t xml:space="preserve"> </w:t>
+            </w:r>
+            <w:r>
+              <w:t xml:space="preserve">path; the list shows</w:t>
+            </w:r>
+            <w:r>
+              <w:t xml:space="preserve"> </w:t>
+            </w:r>
+            <w:r>
+              <w:t xml:space="preserve">“Example Plug-in”</w:t>
+            </w:r>
+            <w:r>
+              <w:t xml:space="preserve">; Setup… opens its window (labels right-aligned, red centered reminder, version in the title)</w:t>
+            </w:r>
+          </w:p>
+        </w:tc>
+      </w:tr>
+      <w:tr>
+        <w:tc>
+          <w:tcPr/>
+          <w:p>
+            <w:pPr>
+              <w:pStyle w:val="Compact"/>
+            </w:pPr>
+            <w:r>
+              <w:t xml:space="preserve">9</w:t>
+            </w:r>
+          </w:p>
+        </w:tc>
+        <w:tc>
+          <w:tcPr/>
+          <w:p>
+            <w:pPr>
+              <w:pStyle w:val="Compact"/>
+            </w:pPr>
+            <w:r>
+              <w:t xml:space="preserve">Use</w:t>
+            </w:r>
+            <w:r>
+              <w:t xml:space="preserve"> </w:t>
+            </w:r>
+            <w:r>
+              <w:rPr>
+                <w:rStyle w:val="VerbatimChar"/>
+              </w:rPr>
+              <w:t xml:space="preserve">{Example.Site}-{Example.Name}</w:t>
+            </w:r>
+            <w:r>
+              <w:t xml:space="preserve"> </w:t>
+            </w:r>
+            <w:r>
+              <w:t xml:space="preserve">as file name and download</w:t>
+            </w:r>
+          </w:p>
+        </w:tc>
+        <w:tc>
+          <w:tcPr/>
+          <w:p>
+            <w:pPr>
+              <w:pStyle w:val="Compact"/>
+            </w:pPr>
+            <w:r>
+              <w:t xml:space="preserve">Files named for example</w:t>
+            </w:r>
+            <w:r>
+              <w:t xml:space="preserve"> </w:t>
+            </w:r>
+            <w:r>
+              <w:rPr>
+                <w:rStyle w:val="VerbatimChar"/>
+              </w:rPr>
+              <w:t xml:space="preserve">NORTH-DJI_0001.JPG</w:t>
+            </w:r>
+          </w:p>
+        </w:tc>
+      </w:tr>
+      <w:tr>
+        <w:tc>
+          <w:tcPr/>
+          <w:p>
+            <w:pPr>
+              <w:pStyle w:val="Compact"/>
+            </w:pPr>
+            <w:r>
+              <w:t xml:space="preserve">10</w:t>
+            </w:r>
+          </w:p>
+        </w:tc>
+        <w:tc>
+          <w:tcPr/>
+          <w:p>
+            <w:pPr>
+              <w:pStyle w:val="Compact"/>
+            </w:pPr>
+            <w:r>
+              <w:t xml:space="preserve">Delete the</w:t>
+            </w:r>
+            <w:r>
+              <w:t xml:space="preserve"> </w:t>
+            </w:r>
+            <w:r>
+              <w:rPr>
+                <w:rStyle w:val="VerbatimChar"/>
+              </w:rPr>
+              <w:t xml:space="preserve">.so</w:t>
+            </w:r>
+            <w:r>
+              <w:t xml:space="preserve"> </w:t>
+            </w:r>
+            <w:r>
+              <w:t xml:space="preserve">file and restart</w:t>
+            </w:r>
+          </w:p>
+        </w:tc>
+        <w:tc>
+          <w:tcPr/>
+          <w:p>
+            <w:pPr>
+              <w:pStyle w:val="Compact"/>
+            </w:pPr>
+            <w:r>
+              <w:t xml:space="preserve">The plug-in leaves the list</w:t>
+            </w:r>
+          </w:p>
+        </w:tc>
+      </w:tr>
+      <w:tr>
+        <w:tc>
+          <w:tcPr/>
+          <w:p>
+            <w:pPr>
+              <w:pStyle w:val="Compact"/>
+            </w:pPr>
+            <w:r>
+              <w:t xml:space="preserve">11</w:t>
+            </w:r>
+          </w:p>
+        </w:tc>
+        <w:tc>
+          <w:tcPr/>
+          <w:p>
+            <w:pPr>
+              <w:pStyle w:val="Compact"/>
+            </w:pPr>
+            <w:r>
+              <w:t xml:space="preserve">File &gt; User Profiles &gt; Save, then Load (double-click)</w:t>
+            </w:r>
+          </w:p>
+        </w:tc>
+        <w:tc>
+          <w:tcPr/>
+          <w:p>
+            <w:pPr>
+              <w:pStyle w:val="Compact"/>
+            </w:pPr>
+            <w:r>
+              <w:t xml:space="preserve">Save lists the profiles and suggests the one in use; replacing asks first; Load restores the plug-in settings</w:t>
+            </w:r>
+          </w:p>
+        </w:tc>
+      </w:tr>
+      <w:tr>
+        <w:tc>
+          <w:tcPr/>
+          <w:p>
+            <w:pPr>
+              <w:pStyle w:val="Compact"/>
+            </w:pPr>
+            <w:r>
+              <w:t xml:space="preserve">12</w:t>
+            </w:r>
+          </w:p>
+        </w:tc>
+        <w:tc>
+          <w:tcPr/>
+          <w:p>
+            <w:pPr>
+              <w:pStyle w:val="Compact"/>
+            </w:pPr>
+            <w:r>
+              <w:t xml:space="preserve">Settings with a</w:t>
+            </w:r>
+            <w:r>
+              <w:t xml:space="preserve"> </w:t>
+            </w:r>
+            <w:r>
+              <w:rPr>
+                <w:rStyle w:val="VerbatimChar"/>
+              </w:rPr>
+              <w:t xml:space="preserve">{T}</w:t>
+            </w:r>
+            <w:r>
+              <w:t xml:space="preserve"> </w:t>
+            </w:r>
+            <w:r>
+              <w:t xml:space="preserve">or</w:t>
+            </w:r>
+            <w:r>
+              <w:t xml:space="preserve"> </w:t>
+            </w:r>
+            <w:r>
+              <w:rPr>
+                <w:rStyle w:val="VerbatimChar"/>
+              </w:rPr>
+              <w:t xml:space="preserve">{q}</w:t>
+            </w:r>
+            <w:r>
+              <w:t xml:space="preserve"> </w:t>
+            </w:r>
+            <w:r>
+              <w:t xml:space="preserve">folder and a non-ASCII folder name (for example</w:t>
+            </w:r>
+            <w:r>
+              <w:t xml:space="preserve"> </w:t>
+            </w:r>
+            <w:r>
+              <w:rPr>
+                <w:rStyle w:val="VerbatimChar"/>
+              </w:rPr>
+              <w:t xml:space="preserve">Ü</w:t>
+            </w:r>
+            <w:r>
+              <w:t xml:space="preserve">)</w:t>
+            </w:r>
+          </w:p>
+        </w:tc>
+        <w:tc>
+          <w:tcPr/>
+          <w:p>
+            <w:pPr>
+              <w:pStyle w:val="Compact"/>
+            </w:pPr>
+            <w:r>
+              <w:t xml:space="preserve">Folders are made and files copied</w:t>
+            </w:r>
+          </w:p>
+        </w:tc>
+      </w:tr>
+    </w:tbl>
     <w:sectPr>
       <w:footnotePr>
         <w:numRestart w:val="eachSect"/>

</xml_diff>

<commit_message>
Release build mode: no debug information, about 4 MB instead of 30 MB
New build mode Release in PhotoDownloader.lpi (debug information off, symbols
stripped, smart linking) writes to bin/<os>-release/. Default keeps the debug
information for development. README, Git Instructions, Linux_Build and
CLAUDE.md say to build published files with --build-mode=Release. Build 4.

Co-Authored-By: Claude Opus 5.5 <noreply@anthropic.com>
</commit_message>
<xml_diff>
--- a/docs/Linux_Build.docx
+++ b/docs/Linux_Build.docx
@@ -323,6 +323,36 @@
       <w:pPr>
         <w:pStyle w:val="FirstParagraph"/>
       </w:pPr>
+      <w:r>
+        <w:t xml:space="preserve">For files you publish, use the Release build mode (no debug information, a much smaller program in</w:t>
+      </w:r>
+      <w:r>
+        <w:t xml:space="preserve"> </w:t>
+      </w:r>
+      <w:r>
+        <w:rPr>
+          <w:rStyle w:val="VerbatimChar"/>
+        </w:rPr>
+        <w:t xml:space="preserve">bin/linux-release/</w:t>
+      </w:r>
+      <w:r>
+        <w:t xml:space="preserve">):</w:t>
+      </w:r>
+      <w:r>
+        <w:t xml:space="preserve"> </w:t>
+      </w:r>
+      <w:r>
+        <w:rPr>
+          <w:rStyle w:val="VerbatimChar"/>
+        </w:rPr>
+        <w:t xml:space="preserve">lazbuild -B --build-mode=Release --ws=gtk2 PhotoDownloader.lpi</w:t>
+      </w:r>
+      <w:r>
+        <w:t xml:space="preserve">.</w:t>
+      </w:r>
+      <w:r>
+        <w:t xml:space="preserve"> </w:t>
+      </w:r>
       <w:r>
         <w:rPr>
           <w:rStyle w:val="VerbatimChar"/>

</xml_diff>

<commit_message>
linux/build.sh: build on Linux from the command line
Raises BuildNr by one (lazbuild does not), builds with GTK 2 (debug, or release), shows only the errors on failure, and can start the program (run). Linux_Build.md explains it. Two_Computers_Guide.txt: signing in on Linux with a personal access token, and GitHub Desktop pulls that seem to change nothing.

Co-Authored-By: Claude Opus 5.5 <noreply@anthropic.com>
</commit_message>
<xml_diff>
--- a/docs/Linux_Build.docx
+++ b/docs/Linux_Build.docx
@@ -288,6 +288,119 @@
         <w:t xml:space="preserve">Build</w:t>
       </w:r>
       <w:bookmarkEnd w:id="11"/>
+    </w:p>
+    <w:p>
+      <w:pPr>
+        <w:pStyle w:val="FirstParagraph"/>
+      </w:pPr>
+      <w:r>
+        <w:t xml:space="preserve">The easiest way is the build script, run in the project folder:</w:t>
+      </w:r>
+    </w:p>
+    <w:p>
+      <w:pPr>
+        <w:pStyle w:val="SourceCode"/>
+      </w:pPr>
+      <w:r>
+        <w:rPr>
+          <w:rStyle w:val="VerbatimChar"/>
+        </w:rPr>
+        <w:t xml:space="preserve">linux/build.sh              # debug build -&gt; bin/linux/PhotoDownloader</w:t>
+      </w:r>
+      <w:r>
+        <w:br/>
+      </w:r>
+      <w:r>
+        <w:rPr>
+          <w:rStyle w:val="VerbatimChar"/>
+        </w:rPr>
+        <w:t xml:space="preserve">linux/build.sh release      # Release build (small) -&gt; bin/linux-release/PhotoDownloader</w:t>
+      </w:r>
+      <w:r>
+        <w:br/>
+      </w:r>
+      <w:r>
+        <w:rPr>
+          <w:rStyle w:val="VerbatimChar"/>
+        </w:rPr>
+        <w:t xml:space="preserve">linux/build.sh run          # build, then start the program (messages appear in the terminal)</w:t>
+      </w:r>
+    </w:p>
+    <w:p>
+      <w:pPr>
+        <w:pStyle w:val="FirstParagraph"/>
+      </w:pPr>
+      <w:r>
+        <w:t xml:space="preserve">It raises the build number in</w:t>
+      </w:r>
+      <w:r>
+        <w:t xml:space="preserve"> </w:t>
+      </w:r>
+      <w:r>
+        <w:rPr>
+          <w:rStyle w:val="VerbatimChar"/>
+        </w:rPr>
+        <w:t xml:space="preserve">PhotoDownloader.lpi</w:t>
+      </w:r>
+      <w:r>
+        <w:t xml:space="preserve"> </w:t>
+      </w:r>
+      <w:r>
+        <w:t xml:space="preserve">by one (as the Lazarus IDE does;</w:t>
+      </w:r>
+      <w:r>
+        <w:t xml:space="preserve"> </w:t>
+      </w:r>
+      <w:r>
+        <w:rPr>
+          <w:rStyle w:val="VerbatimChar"/>
+        </w:rPr>
+        <w:t xml:space="preserve">lazbuild</w:t>
+      </w:r>
+      <w:r>
+        <w:t xml:space="preserve"> </w:t>
+      </w:r>
+      <w:r>
+        <w:t xml:space="preserve">alone does not), builds with GTK 2 and prints only the errors when the build fails. Commit and push</w:t>
+      </w:r>
+      <w:r>
+        <w:t xml:space="preserve"> </w:t>
+      </w:r>
+      <w:r>
+        <w:rPr>
+          <w:rStyle w:val="VerbatimChar"/>
+        </w:rPr>
+        <w:t xml:space="preserve">PhotoDownloader.lpi</w:t>
+      </w:r>
+      <w:r>
+        <w:t xml:space="preserve"> </w:t>
+      </w:r>
+      <w:r>
+        <w:t xml:space="preserve">afterwards. If Git did not keep the file executable, run</w:t>
+      </w:r>
+      <w:r>
+        <w:t xml:space="preserve"> </w:t>
+      </w:r>
+      <w:r>
+        <w:rPr>
+          <w:rStyle w:val="VerbatimChar"/>
+        </w:rPr>
+        <w:t xml:space="preserve">sh linux/build.sh</w:t>
+      </w:r>
+      <w:r>
+        <w:t xml:space="preserve"> </w:t>
+      </w:r>
+      <w:r>
+        <w:t xml:space="preserve">instead.</w:t>
+      </w:r>
+    </w:p>
+    <w:p>
+      <w:pPr>
+        <w:pStyle w:val="BodyText"/>
+      </w:pPr>
+      <w:r>
+        <w:t xml:space="preserve">The same by hand:</w:t>
+      </w:r>
     </w:p>
     <w:p>
       <w:pPr>

</xml_diff>

<commit_message>
linux/build.sh keeps the build number in step: pull before, push the number after
Before building it pulls (--ff-only); after the build (also a failed one, every compile counts) it commits only PhotoDownloader.lpi as 'Build number N (Linux)' and pushes. Without network it warns and builds anyway; --no-git skips both. Tested with a stand-in lazbuild and local test repositories. Docs: Linux_Build.md, Two_Computers_Guide.txt, Continuation Prompt; Edit list... tested on Linux by the user (Spec).

Co-Authored-By: Claude Opus 5.5 <noreply@anthropic.com>
</commit_message>
<xml_diff>
--- a/docs/Linux_Build.docx
+++ b/docs/Linux_Build.docx
@@ -331,7 +331,16 @@
         <w:pStyle w:val="FirstParagraph"/>
       </w:pPr>
       <w:r>
-        <w:t xml:space="preserve">It raises the build number in</w:t>
+        <w:t xml:space="preserve">It keeps the build number in step with the other computer: it first pulls from GitHub (</w:t>
+      </w:r>
+      <w:r>
+        <w:rPr>
+          <w:rStyle w:val="VerbatimChar"/>
+        </w:rPr>
+        <w:t xml:space="preserve">git pull --ff-only</w:t>
+      </w:r>
+      <w:r>
+        <w:t xml:space="preserve">), raises the build number in</w:t>
       </w:r>
       <w:r>
         <w:t xml:space="preserve"> </w:t>
@@ -361,7 +370,7 @@
         <w:t xml:space="preserve"> </w:t>
       </w:r>
       <w:r>
-        <w:t xml:space="preserve">alone does not), builds with GTK 2 and prints only the errors when the build fails. Commit and push</w:t>
+        <w:t xml:space="preserve">alone does not), builds with GTK 2 (printing only the errors when the build fails), then commits only</w:t>
       </w:r>
       <w:r>
         <w:t xml:space="preserve"> </w:t>
@@ -376,7 +385,46 @@
         <w:t xml:space="preserve"> </w:t>
       </w:r>
       <w:r>
-        <w:t xml:space="preserve">afterwards. If Git did not keep the file executable, run</w:t>
+        <w:t xml:space="preserve">as</w:t>
+      </w:r>
+      <w:r>
+        <w:t xml:space="preserve"> </w:t>
+      </w:r>
+      <w:r>
+        <w:t xml:space="preserve">“Build number N (Linux)”</w:t>
+      </w:r>
+      <w:r>
+        <w:t xml:space="preserve"> </w:t>
+      </w:r>
+      <w:r>
+        <w:t xml:space="preserve">and pushes it, also after a failed build, since every compile counts. Any of your own commits that were not pushed yet go along. Without network it warns and builds anyway (push later with</w:t>
+      </w:r>
+      <w:r>
+        <w:t xml:space="preserve"> </w:t>
+      </w:r>
+      <w:r>
+        <w:rPr>
+          <w:rStyle w:val="VerbatimChar"/>
+        </w:rPr>
+        <w:t xml:space="preserve">git push</w:t>
+      </w:r>
+      <w:r>
+        <w:t xml:space="preserve">);</w:t>
+      </w:r>
+      <w:r>
+        <w:t xml:space="preserve"> </w:t>
+      </w:r>
+      <w:r>
+        <w:rPr>
+          <w:rStyle w:val="VerbatimChar"/>
+        </w:rPr>
+        <w:t xml:space="preserve">linux/build.sh --no-git</w:t>
+      </w:r>
+      <w:r>
+        <w:t xml:space="preserve"> </w:t>
+      </w:r>
+      <w:r>
+        <w:t xml:space="preserve">builds without pulling or pushing. If Git did not keep the file executable, run</w:t>
       </w:r>
       <w:r>
         <w:t xml:space="preserve"> </w:t>

</xml_diff>

<commit_message>
Build number: lazbuild counts it up itself; build.sh no longer adds one more
Built 0.1.3.10 (Windows): the lpi now holds 11, the next build. lazbuild (AutoIncrementBuild) puts the number of the lpi into the program and then saves the lpi with the next number, like the IDE; raising it by hand skipped a number. linux/build.sh: pulls, builds, sets the lpi to the committed file with only BuildNr = built + 1 (undoing lazbuild's LCLWidgetType rewrites), commits 'Built 0.1.3.N (Linux)' and pushes. Tested with a lazbuild stand-in that counts up and rewrites the file. CLAUDE.md, README, Linux_Build, Two_Computers_Guide and Continuation Prompt corrected.

Co-Authored-By: Claude Opus 5.5 <noreply@anthropic.com>
</commit_message>
<xml_diff>
--- a/docs/Linux_Build.docx
+++ b/docs/Linux_Build.docx
@@ -340,7 +340,7 @@
         <w:t xml:space="preserve">git pull --ff-only</w:t>
       </w:r>
       <w:r>
-        <w:t xml:space="preserve">), raises the build number in</w:t>
+        <w:t xml:space="preserve">) and builds with GTK 2 (printing only the errors when the build fails).</w:t>
       </w:r>
       <w:r>
         <w:t xml:space="preserve"> </w:t>
@@ -355,7 +355,7 @@
         <w:t xml:space="preserve"> </w:t>
       </w:r>
       <w:r>
-        <w:t xml:space="preserve">by one (as the Lazarus IDE does;</w:t>
+        <w:t xml:space="preserve">holds the number of the next build:</w:t>
       </w:r>
       <w:r>
         <w:t xml:space="preserve"> </w:t>
@@ -370,7 +370,7 @@
         <w:t xml:space="preserve"> </w:t>
       </w:r>
       <w:r>
-        <w:t xml:space="preserve">alone does not), builds with GTK 2 (printing only the errors when the build fails), then commits only</w:t>
+        <w:t xml:space="preserve">puts it into the program and counts the file up by one itself, like the Lazarus IDE. Then the script commits only the new BuildNr line of</w:t>
       </w:r>
       <w:r>
         <w:t xml:space="preserve"> </w:t>
@@ -385,13 +385,28 @@
         <w:t xml:space="preserve"> </w:t>
       </w:r>
       <w:r>
-        <w:t xml:space="preserve">as</w:t>
-      </w:r>
-      <w:r>
-        <w:t xml:space="preserve"> </w:t>
-      </w:r>
-      <w:r>
-        <w:t xml:space="preserve">“Build number N (Linux)”</w:t>
+        <w:t xml:space="preserve">(the other lines</w:t>
+      </w:r>
+      <w:r>
+        <w:t xml:space="preserve"> </w:t>
+      </w:r>
+      <w:r>
+        <w:rPr>
+          <w:rStyle w:val="VerbatimChar"/>
+        </w:rPr>
+        <w:t xml:space="preserve">lazbuild</w:t>
+      </w:r>
+      <w:r>
+        <w:t xml:space="preserve"> </w:t>
+      </w:r>
+      <w:r>
+        <w:t xml:space="preserve">rewrites stay as committed) as</w:t>
+      </w:r>
+      <w:r>
+        <w:t xml:space="preserve"> </w:t>
+      </w:r>
+      <w:r>
+        <w:t xml:space="preserve">“Built 0.1.3.N (Linux)”</w:t>
       </w:r>
       <w:r>
         <w:t xml:space="preserve"> </w:t>

</xml_diff>